<commit_message>
fix(submission): mask self-citations, fill P6 OSF DOI, use JED 8500-word P3
Submission-readiness audit fixes:
- Double-blind anonymity: masked author self-citations (in-text + reference
  list) in P5 (IJOEM), P6 (JWB) and P7 (IBR) to "Authors (year)" / "Authors.
  (year). Details omitted for double-blind review." — removes identity leaks
  that risk desk rejection. Regenerated the three manuscript docx from the
  (previously stale) markdown.
- P6: filled the OSF DOI placeholder with the real registration
  10.17605/OSF.IO/Z37KN.
- P3 bundle: switched to the JED-mandated 8,500-word version
  (01_manuscript_blinded_8500) — the full-length version exceeds JED's cap and
  must not be submitted.

Remaining at-submission items (not blockers): P9 cover-letter date; P6 ICRV
inter-coder kappa awaits real dual-coding (flagged, not fabricated).

Co-Authored-By: Claude Opus 4.8 (1M context) <noreply@anthropic.com>
Claude-Session: https://claude.ai/code/session_01Xumaoraa2DLWLXsgJJ62oq
</commit_message>
<xml_diff>
--- a/dist/BO_NOP_HOAN_CHINH_2026-06/1_papers/P5_IJOEM/01_manuscript_blinded.docx
+++ b/dist/BO_NOP_HOAN_CHINH_2026-06/1_papers/P5_IJOEM/01_manuscript_blinded.docx
@@ -128,7 +128,7 @@
         <w:t xml:space="preserve"> </w:t>
       </w:r>
       <w:r>
-        <w:t xml:space="preserve">estimates with 95% CIs; Figure 3 predicted I→P curves by wave; Figure 4</w:t>
+        <w:t xml:space="preserve">estimates with 95% CIs; Figure 3 predicted I to P curves by wave; Figure 4</w:t>
       </w:r>
       <w:r>
         <w:t xml:space="preserve"> </w:t>
@@ -493,13 +493,13 @@
         <w:t xml:space="preserve"> </w:t>
       </w:r>
       <w:r>
-        <w:t xml:space="preserve">in both 2012 (turning point 49.4 %)</w:t>
-      </w:r>
-      <w:r>
-        <w:t xml:space="preserve"> </w:t>
-      </w:r>
-      <w:r>
-        <w:t xml:space="preserve">and 2024 (turning point 47.2 %) waves, with overlapping 95 %</w:t>
+        <w:t xml:space="preserve">in both 2012 (turning point 49.4 %)</w:t>
+      </w:r>
+      <w:r>
+        <w:t xml:space="preserve"> </w:t>
+      </w:r>
+      <w:r>
+        <w:t xml:space="preserve">and 2024 (turning point 47.2 %) waves, with overlapping 95 %</w:t>
       </w:r>
       <w:r>
         <w:t xml:space="preserve"> </w:t>
@@ -533,13 +533,13 @@
         <w:t xml:space="preserve"> </w:t>
       </w:r>
       <w:r>
-        <w:t xml:space="preserve">coefficient equality across waves (FSTS z = +0.82, p = .412; FSTS²</w:t>
-      </w:r>
-      <w:r>
-        <w:t xml:space="preserve"> </w:t>
-      </w:r>
-      <w:r>
-        <w:t xml:space="preserve">z = −0.61, p = .545), supporting structural durability over</w:t>
+        <w:t xml:space="preserve">coefficient equality across waves (FSTS z = +0.82, p = .412; FSTS²</w:t>
+      </w:r>
+      <w:r>
+        <w:t xml:space="preserve"> </w:t>
+      </w:r>
+      <w:r>
+        <w:t xml:space="preserve">z = −0.61, p = .545), supporting structural durability over</w:t>
       </w:r>
       <w:r>
         <w:t xml:space="preserve"> </w:t>
@@ -573,7 +573,7 @@
         <w:t xml:space="preserve"> </w:t>
       </w:r>
       <w:r>
-        <w:t xml:space="preserve">of productivity in both waves (β_z = +0.28 in 2012 and +0.43 in 2024)</w:t>
+        <w:t xml:space="preserve">of productivity in both waves (β_z = +0.28 in 2012 and +0.43 in 2024)</w:t>
       </w:r>
       <w:r>
         <w:t xml:space="preserve"> </w:t>
@@ -673,11 +673,11 @@
         <w:t xml:space="preserve"> </w:t>
       </w:r>
       <w:r>
-        <w:t xml:space="preserve">threshold centred around 48 % export intensity regardless of decade.</w:t>
+        <w:t xml:space="preserve">threshold centred around 48 % export intensity regardless of decade.</w:t>
       </w:r>
     </w:p>
     <w:bookmarkEnd w:id="21"/>
-    <w:bookmarkStart w:id="22" w:name="Xe3d0fc0bea9a42ce7605565d0964033d7f6ee47"/>
+    <w:bookmarkStart w:id="22" w:name="introduction"/>
     <w:p>
       <w:pPr>
         <w:pStyle w:val="Heading2"/>
@@ -925,19 +925,19 @@
         <w:pStyle w:val="BodyText"/>
       </w:pPr>
       <w:r>
-        <w:t xml:space="preserve">The remainder of the paper is organised as follows. Section 2 develops</w:t>
-      </w:r>
-      <w:r>
-        <w:t xml:space="preserve"> </w:t>
-      </w:r>
-      <w:r>
-        <w:t xml:space="preserve">the theoretical framework and hypotheses. Section 3 describes data,</w:t>
-      </w:r>
-      <w:r>
-        <w:t xml:space="preserve"> </w:t>
-      </w:r>
-      <w:r>
-        <w:t xml:space="preserve">variables, and methods. Section 4 presents results. Section 5 discusses</w:t>
+        <w:t xml:space="preserve">The remainder of the paper is organised as follows. Section 2 develops</w:t>
+      </w:r>
+      <w:r>
+        <w:t xml:space="preserve"> </w:t>
+      </w:r>
+      <w:r>
+        <w:t xml:space="preserve">the theoretical framework and hypotheses. Section 3 describes data,</w:t>
+      </w:r>
+      <w:r>
+        <w:t xml:space="preserve"> </w:t>
+      </w:r>
+      <w:r>
+        <w:t xml:space="preserve">variables, and methods. Section 4 presents results. Section 5 discusses</w:t>
       </w:r>
       <w:r>
         <w:t xml:space="preserve"> </w:t>
@@ -947,7 +947,7 @@
       </w:r>
     </w:p>
     <w:bookmarkEnd w:id="22"/>
-    <w:bookmarkStart w:id="26" w:name="X8bf20a63f0decf7b16e99d564b9958ec4fbbb23"/>
+    <w:bookmarkStart w:id="26" w:name="theory-and-hypotheses"/>
     <w:p>
       <w:pPr>
         <w:pStyle w:val="Heading2"/>
@@ -956,7 +956,7 @@
         <w:t xml:space="preserve">2. Theory and Hypotheses</w:t>
       </w:r>
     </w:p>
-    <w:bookmarkStart w:id="23" w:name="Xe089a51cf00ad631dbcdfa837bfcf2befbbb388"/>
+    <w:bookmarkStart w:id="23" w:name="X80f1b9a6838da6506200db77e2279c8969787f1"/>
     <w:p>
       <w:pPr>
         <w:pStyle w:val="Heading3"/>
@@ -1012,7 +1012,7 @@
         <w:t xml:space="preserve"> </w:t>
       </w:r>
       <w:r>
-        <w:t xml:space="preserve">up to roughly 40–60 % is associated with learning-by-exporting effects</w:t>
+        <w:t xml:space="preserve">up to roughly 40–60 % is associated with learning-by-exporting effects</w:t>
       </w:r>
       <w:r>
         <w:t xml:space="preserve"> </w:t>
@@ -1106,7 +1106,7 @@
       </w:r>
     </w:p>
     <w:bookmarkEnd w:id="23"/>
-    <w:bookmarkStart w:id="24" w:name="Xf1c81d13fe998b882da119ca3ec3b3d40ce5a1b"/>
+    <w:bookmarkStart w:id="24" w:name="temporal-stability-of-the-ip-curvature"/>
     <w:p>
       <w:pPr>
         <w:pStyle w:val="Heading3"/>
@@ -1150,7 +1150,25 @@
         <w:t xml:space="preserve"> </w:t>
       </w:r>
       <w:r>
-        <w:t xml:space="preserve">sensitive to structural context, generating a “wave-specific” pattern</w:t>
+        <w:t xml:space="preserve">sensitive to structural context, generating a</w:t>
+      </w:r>
+      <w:r>
+        <w:t xml:space="preserve"> </w:t>
+      </w:r>
+      <w:r>
+        <w:t xml:space="preserve">“</w:t>
+      </w:r>
+      <w:r>
+        <w:t xml:space="preserve">wave-specific</w:t>
+      </w:r>
+      <w:r>
+        <w:t xml:space="preserve">”</w:t>
+      </w:r>
+      <w:r>
+        <w:t xml:space="preserve"> </w:t>
+      </w:r>
+      <w:r>
+        <w:t xml:space="preserve">pattern</w:t>
       </w:r>
       <w:r>
         <w:t xml:space="preserve"> </w:t>
@@ -1186,7 +1204,7 @@
         <w:t xml:space="preserve"> </w:t>
       </w:r>
       <w:r>
-        <w:t xml:space="preserve">When China's export environment shifts substantially between</w:t>
+        <w:t xml:space="preserve">When China’s export environment shifts substantially between</w:t>
       </w:r>
       <w:r>
         <w:t xml:space="preserve"> </w:t>
@@ -1246,7 +1264,7 @@
         <w:t xml:space="preserve"> </w:t>
       </w:r>
       <w:r>
-        <w:t xml:space="preserve">When China's institutional framework governing export costs</w:t>
+        <w:t xml:space="preserve">When China’s institutional framework governing export costs</w:t>
       </w:r>
       <w:r>
         <w:t xml:space="preserve"> </w:t>
@@ -1298,7 +1316,7 @@
       </w:r>
     </w:p>
     <w:bookmarkEnd w:id="24"/>
-    <w:bookmarkStart w:id="25" w:name="X505f50cd1f9abb1ab06672992aff36a1dc7f136"/>
+    <w:bookmarkStart w:id="25" w:name="technological-capability-as-a-moderator"/>
     <w:p>
       <w:pPr>
         <w:pStyle w:val="Heading3"/>
@@ -1542,7 +1560,7 @@
           <w:bCs/>
           <w:b/>
         </w:rPr>
-        <w:t xml:space="preserve">Figure 1.</w:t>
+        <w:t xml:space="preserve">Figure 1.</w:t>
       </w:r>
       <w:r>
         <w:t xml:space="preserve"> </w:t>
@@ -1566,12 +1584,12 @@
         <w:t xml:space="preserve"> </w:t>
       </w:r>
       <w:r>
-        <w:t xml:space="preserve">exploratory mechanism analyses evaluated in §4.5.</w:t>
+        <w:t xml:space="preserve">exploratory mechanism analyses evaluated in Section 4.5.</w:t>
       </w:r>
     </w:p>
     <w:bookmarkEnd w:id="25"/>
     <w:bookmarkEnd w:id="26"/>
-    <w:bookmarkStart w:id="30" w:name="X5eb800a903106e48a684e9ea9de39ed619b9df8"/>
+    <w:bookmarkStart w:id="30" w:name="data-and-methods"/>
     <w:p>
       <w:pPr>
         <w:pStyle w:val="Heading2"/>
@@ -1580,7 +1598,7 @@
         <w:t xml:space="preserve">3. Data and Methods</w:t>
       </w:r>
     </w:p>
-    <w:bookmarkStart w:id="27" w:name="X7539fb3dc2f98232f41138bc75cab658563f4ee"/>
+    <w:bookmarkStart w:id="27" w:name="data"/>
     <w:p>
       <w:pPr>
         <w:pStyle w:val="Heading3"/>
@@ -1737,7 +1755,7 @@
         <w:t xml:space="preserve"> </w:t>
       </w:r>
       <w:r>
-        <w:t xml:space="preserve">in §4.6.</w:t>
+        <w:t xml:space="preserve">in Section 4.6.</w:t>
       </w:r>
     </w:p>
     <w:p>
@@ -1867,7 +1885,7 @@
         <w:t xml:space="preserve"> </w:t>
       </w:r>
       <w:r>
-        <w:t xml:space="preserve">paper (abstract, Table 1, Table 2). World Bank nonresponse codes (−9 and</w:t>
+        <w:t xml:space="preserve">paper (abstract, Table 1, Table 2). World Bank nonresponse codes (−9 and</w:t>
       </w:r>
       <w:r>
         <w:t xml:space="preserve"> </w:t>
@@ -1921,7 +1939,7 @@
         <w:t xml:space="preserve"> </w:t>
       </w:r>
       <w:r>
-        <w:t xml:space="preserve">sizes, turning‑point estimates (49.4 % in 2012, 47.2 % in 2024, 48.8 %</w:t>
+        <w:t xml:space="preserve">sizes, turning‑point estimates (49.4 % in 2012, 47.2 % in 2024, 48.8 %</w:t>
       </w:r>
       <w:r>
         <w:t xml:space="preserve"> </w:t>
@@ -1993,7 +2011,7 @@
         <w:t xml:space="preserve"> </w:t>
       </w:r>
       <w:r>
-        <w:t xml:space="preserve">non-missing) retains 1,940 of 2,189 firms (88.6 %). By contrast, the</w:t>
+        <w:t xml:space="preserve">non-missing) retains 1,940 of 2,189 firms (88.6 %). By contrast, the</w:t>
       </w:r>
       <w:r>
         <w:t xml:space="preserve"> </w:t>
@@ -2017,7 +2035,7 @@
         <w:t xml:space="preserve"> </w:t>
       </w:r>
       <w:r>
-        <w:t xml:space="preserve">sample to 4,544. Turning-point estimates (47.2 % in 2024) and</w:t>
+        <w:t xml:space="preserve">sample to 4,544. Turning-point estimates (47.2 % in 2024) and</w:t>
       </w:r>
       <w:r>
         <w:t xml:space="preserve"> </w:t>
@@ -2027,7 +2045,7 @@
       </w:r>
     </w:p>
     <w:bookmarkEnd w:id="27"/>
-    <w:bookmarkStart w:id="28" w:name="X431a8b355211b47c6e494a5f659051454df4ed1"/>
+    <w:bookmarkStart w:id="28" w:name="measures"/>
     <w:p>
       <w:pPr>
         <w:pStyle w:val="Heading3"/>
@@ -2411,7 +2429,7 @@
         <w:t xml:space="preserve">b2b</w:t>
       </w:r>
       <w:r>
-        <w:t xml:space="preserve">, &gt; 10 % foreign equity); (d) ISIC 2-digit industry stratum</w:t>
+        <w:t xml:space="preserve">, &gt; 10 % foreign equity); (d) ISIC 2-digit industry stratum</w:t>
       </w:r>
       <w:r>
         <w:t xml:space="preserve"> </w:t>
@@ -2421,7 +2439,7 @@
       </w:r>
     </w:p>
     <w:bookmarkEnd w:id="28"/>
-    <w:bookmarkStart w:id="29" w:name="X88d3b635b18ee197bee6ec760e4576787847be1"/>
+    <w:bookmarkStart w:id="29" w:name="estimation-strategy"/>
     <w:p>
       <w:pPr>
         <w:pStyle w:val="Heading3"/>
@@ -2465,7 +2483,7 @@
         <w:t xml:space="preserve"> </w:t>
       </w:r>
       <w:r>
-        <w:t xml:space="preserve">2024 waves (see §5.4). The pooled specification therefore stacks the two</w:t>
+        <w:t xml:space="preserve">2024 waves (see Section 5.4). The pooled specification therefore stacks the two</w:t>
       </w:r>
       <w:r>
         <w:t xml:space="preserve"> </w:t>
@@ -2503,7 +2521,7 @@
         <w:t xml:space="preserve"> </w:t>
       </w:r>
       <w:r>
-        <w:t xml:space="preserve">(2β₂), with 95 % CIs computed via the delta-method gradient. Lind and</w:t>
+        <w:t xml:space="preserve">(2β₂), with 95 % CIs computed via the delta-method gradient. Lind and</w:t>
       </w:r>
       <w:r>
         <w:t xml:space="preserve"> </w:t>
@@ -2780,7 +2798,7 @@
     </w:p>
     <w:bookmarkEnd w:id="29"/>
     <w:bookmarkEnd w:id="30"/>
-    <w:bookmarkStart w:id="37" w:name="X121719332867ee227f0a04b486098cee978c6e6"/>
+    <w:bookmarkStart w:id="37" w:name="results"/>
     <w:p>
       <w:pPr>
         <w:pStyle w:val="Heading2"/>
@@ -2789,7 +2807,7 @@
         <w:t xml:space="preserve">4. Results</w:t>
       </w:r>
     </w:p>
-    <w:bookmarkStart w:id="31" w:name="Xcfcbc1028680fbd618b9b585dd17cf608861803"/>
+    <w:bookmarkStart w:id="31" w:name="descriptive-statistics"/>
     <w:p>
       <w:pPr>
         <w:pStyle w:val="Heading3"/>
@@ -2815,7 +2833,7 @@
         <w:t xml:space="preserve"> </w:t>
       </w:r>
       <w:r>
-        <w:t xml:space="preserve">1.19) and mean export intensity of 5.2 %, with 19.4 % of firms reporting</w:t>
+        <w:t xml:space="preserve">1.19) and mean export intensity of 5.2 %, with 19.4 % of firms reporting</w:t>
       </w:r>
       <w:r>
         <w:t xml:space="preserve"> </w:t>
@@ -2833,7 +2851,7 @@
         <w:t xml:space="preserve"> </w:t>
       </w:r>
       <w:r>
-        <w:t xml:space="preserve">of 0.49 log units, and mean export intensity of 3.6 %, with 12.4 % of</w:t>
+        <w:t xml:space="preserve">of 0.49 log units, and mean export intensity of 3.6 %, with 12.4 % of</w:t>
       </w:r>
       <w:r>
         <w:t xml:space="preserve"> </w:t>
@@ -2857,13 +2875,13 @@
         <w:t xml:space="preserve"> </w:t>
       </w:r>
       <w:r>
-        <w:t xml:space="preserve">TCI_full is available for 1,639 firms in 2012 (63 %) and 1,920 firms in</w:t>
-      </w:r>
-      <w:r>
-        <w:t xml:space="preserve"> </w:t>
-      </w:r>
-      <w:r>
-        <w:t xml:space="preserve">2024 (99 %), reflecting a significant improvement in WBES coverage of</w:t>
+        <w:t xml:space="preserve">TCI_full is available for 1,639 firms in 2012 (63 %) and 1,920 firms in</w:t>
+      </w:r>
+      <w:r>
+        <w:t xml:space="preserve"> </w:t>
+      </w:r>
+      <w:r>
+        <w:t xml:space="preserve">2024 (99 %), reflecting a significant improvement in WBES coverage of</w:t>
       </w:r>
       <w:r>
         <w:t xml:space="preserve"> </w:t>
@@ -2899,14 +2917,14 @@
     <w:tbl>
       <w:tblPr>
         <w:tblStyle w:val="Table"/>
-        <w:tblW w:type="auto" w:w="0"/>
+        <w:tblW w:type="pct" w:w="5000"/>
         <w:tblLook w:firstRow="1" w:lastRow="0" w:firstColumn="0" w:lastColumn="0" w:noHBand="0" w:noVBand="0" w:val="0020"/>
         <w:jc w:val="start"/>
       </w:tblPr>
       <w:tblGrid>
-        <w:gridCol w:w="2640"/>
-        <w:gridCol w:w="2640"/>
-        <w:gridCol w:w="2640"/>
+        <w:gridCol w:w="4168"/>
+        <w:gridCol w:w="1875"/>
+        <w:gridCol w:w="1875"/>
       </w:tblGrid>
       <w:tr>
         <w:trPr>
@@ -3046,19 +3064,19 @@
               <w:jc w:val="left"/>
             </w:pPr>
             <w:r>
-              <w:t xml:space="preserve">19.4 %</w:t>
-            </w:r>
-          </w:p>
-        </w:tc>
-        <w:tc>
-          <w:tcPr/>
-          <w:p>
-            <w:pPr>
-              <w:pStyle w:val="Compact"/>
-              <w:jc w:val="left"/>
-            </w:pPr>
-            <w:r>
-              <w:t xml:space="preserve">12.4 %</w:t>
+              <w:t xml:space="preserve">19.4 %</w:t>
+            </w:r>
+          </w:p>
+        </w:tc>
+        <w:tc>
+          <w:tcPr/>
+          <w:p>
+            <w:pPr>
+              <w:pStyle w:val="Compact"/>
+              <w:jc w:val="left"/>
+            </w:pPr>
+            <w:r>
+              <w:t xml:space="preserve">12.4 %</w:t>
             </w:r>
           </w:p>
         </w:tc>
@@ -3148,31 +3166,31 @@
               <w:jc w:val="left"/>
             </w:pPr>
             <w:r>
-              <w:t xml:space="preserve">Foreign ownership &gt; 10 %</w:t>
-            </w:r>
-          </w:p>
-        </w:tc>
-        <w:tc>
-          <w:tcPr/>
-          <w:p>
-            <w:pPr>
-              <w:pStyle w:val="Compact"/>
-              <w:jc w:val="left"/>
-            </w:pPr>
-            <w:r>
-              <w:t xml:space="preserve">5.8 %</w:t>
-            </w:r>
-          </w:p>
-        </w:tc>
-        <w:tc>
-          <w:tcPr/>
-          <w:p>
-            <w:pPr>
-              <w:pStyle w:val="Compact"/>
-              <w:jc w:val="left"/>
-            </w:pPr>
-            <w:r>
-              <w:t xml:space="preserve">3.7 %</w:t>
+              <w:t xml:space="preserve">Foreign ownership &gt; 10 %</w:t>
+            </w:r>
+          </w:p>
+        </w:tc>
+        <w:tc>
+          <w:tcPr/>
+          <w:p>
+            <w:pPr>
+              <w:pStyle w:val="Compact"/>
+              <w:jc w:val="left"/>
+            </w:pPr>
+            <w:r>
+              <w:t xml:space="preserve">5.8 %</w:t>
+            </w:r>
+          </w:p>
+        </w:tc>
+        <w:tc>
+          <w:tcPr/>
+          <w:p>
+            <w:pPr>
+              <w:pStyle w:val="Compact"/>
+              <w:jc w:val="left"/>
+            </w:pPr>
+            <w:r>
+              <w:t xml:space="preserve">3.7 %</w:t>
             </w:r>
           </w:p>
         </w:tc>
@@ -3281,7 +3299,7 @@
       </w:r>
     </w:p>
     <w:bookmarkEnd w:id="31"/>
-    <w:bookmarkStart w:id="32" w:name="X34b83cd764295e21fd4e71e3151b388b8f2159e"/>
+    <w:bookmarkStart w:id="32" w:name="main-threshold-results"/>
     <w:p>
       <w:pPr>
         <w:pStyle w:val="Heading3"/>
@@ -3399,13 +3417,13 @@
         <w:pStyle w:val="BodyText"/>
       </w:pPr>
       <w:r>
-        <w:t xml:space="preserve">Turning-point estimates are 49.4 % (95 % CI: 43.1–55.7 %) in 2012 and</w:t>
-      </w:r>
-      <w:r>
-        <w:t xml:space="preserve"> </w:t>
-      </w:r>
-      <w:r>
-        <w:t xml:space="preserve">47.2 % (95 % CI: 40.8–53.6 %) in 2024. The CIs overlap substantially,</w:t>
+        <w:t xml:space="preserve">Turning-point estimates are 49.4 % (95 % CI: 43.1–55.7 %) in 2012 and</w:t>
+      </w:r>
+      <w:r>
+        <w:t xml:space="preserve"> </w:t>
+      </w:r>
+      <w:r>
+        <w:t xml:space="preserve">47.2 % (95 % CI: 40.8–53.6 %) in 2024. The CIs overlap substantially,</w:t>
       </w:r>
       <w:r>
         <w:t xml:space="preserve"> </w:t>
@@ -3441,7 +3459,7 @@
         <w:t xml:space="preserve"> </w:t>
       </w:r>
       <w:r>
-        <w:t xml:space="preserve">structurally durable: the 12-year interval spanning China's WTO</w:t>
+        <w:t xml:space="preserve">structurally durable: the 12-year interval spanning China’s WTO</w:t>
       </w:r>
       <w:r>
         <w:t xml:space="preserve"> </w:t>
@@ -3497,13 +3515,13 @@
         <w:t xml:space="preserve"> </w:t>
       </w:r>
       <w:r>
-        <w:t xml:space="preserve">β = −1.55 (p &lt; .001), with turning point at 48.8 % (95 % CI:</w:t>
-      </w:r>
-      <w:r>
-        <w:t xml:space="preserve"> </w:t>
-      </w:r>
-      <w:r>
-        <w:t xml:space="preserve">44.2–53.4 %).</w:t>
+        <w:t xml:space="preserve">β = −1.55 (p &lt; .001), with turning point at 48.8 % (95 % CI:</w:t>
+      </w:r>
+      <w:r>
+        <w:t xml:space="preserve"> </w:t>
+      </w:r>
+      <w:r>
+        <w:t xml:space="preserve">44.2–53.4 %).</w:t>
       </w:r>
     </w:p>
     <w:p>
@@ -3533,15 +3551,15 @@
     <w:tbl>
       <w:tblPr>
         <w:tblStyle w:val="Table"/>
-        <w:tblW w:type="auto" w:w="0"/>
+        <w:tblW w:type="pct" w:w="5000"/>
         <w:tblLook w:firstRow="1" w:lastRow="0" w:firstColumn="0" w:lastColumn="0" w:noHBand="0" w:noVBand="0" w:val="0020"/>
         <w:jc w:val="start"/>
       </w:tblPr>
       <w:tblGrid>
-        <w:gridCol w:w="1980"/>
-        <w:gridCol w:w="1980"/>
-        <w:gridCol w:w="1980"/>
-        <w:gridCol w:w="1980"/>
+        <w:gridCol w:w="2043"/>
+        <w:gridCol w:w="1958"/>
+        <w:gridCol w:w="1958"/>
+        <w:gridCol w:w="1958"/>
       </w:tblGrid>
       <w:tr>
         <w:trPr>
@@ -3925,7 +3943,7 @@
                 <w:bCs/>
                 <w:b/>
               </w:rPr>
-              <w:t xml:space="preserve">49.4 %</w:t>
+              <w:t xml:space="preserve">49.4 %</w:t>
             </w:r>
           </w:p>
         </w:tc>
@@ -3941,7 +3959,7 @@
                 <w:bCs/>
                 <w:b/>
               </w:rPr>
-              <w:t xml:space="preserve">47.2 %</w:t>
+              <w:t xml:space="preserve">47.2 %</w:t>
             </w:r>
           </w:p>
         </w:tc>
@@ -3957,7 +3975,7 @@
                 <w:bCs/>
                 <w:b/>
               </w:rPr>
-              <w:t xml:space="preserve">48.8 %</w:t>
+              <w:t xml:space="preserve">48.8 %</w:t>
             </w:r>
           </w:p>
         </w:tc>
@@ -3971,7 +3989,7 @@
               <w:jc w:val="left"/>
             </w:pPr>
             <w:r>
-              <w:t xml:space="preserve">95 % CI (delta method)</w:t>
+              <w:t xml:space="preserve">95 % CI (delta method)</w:t>
             </w:r>
           </w:p>
         </w:tc>
@@ -4150,19 +4168,19 @@
           <w:bCs/>
           <w:b/>
         </w:rPr>
-        <w:t xml:space="preserve">Figure 2.</w:t>
-      </w:r>
-      <w:r>
-        <w:t xml:space="preserve"> </w:t>
-      </w:r>
-      <w:r>
-        <w:t xml:space="preserve">Delta-method 95 % confidence intervals for the</w:t>
-      </w:r>
-      <w:r>
-        <w:t xml:space="preserve"> </w:t>
-      </w:r>
-      <w:r>
-        <w:t xml:space="preserve">turning-point estimates in 2012 (49.4 %) and 2024 (47.2 %). The</w:t>
+        <w:t xml:space="preserve">Figure 2.</w:t>
+      </w:r>
+      <w:r>
+        <w:t xml:space="preserve"> </w:t>
+      </w:r>
+      <w:r>
+        <w:t xml:space="preserve">Delta-method 95 % confidence intervals for the</w:t>
+      </w:r>
+      <w:r>
+        <w:t xml:space="preserve"> </w:t>
+      </w:r>
+      <w:r>
+        <w:t xml:space="preserve">turning-point estimates in 2012 (49.4 %) and 2024 (47.2 %). The</w:t>
       </w:r>
       <w:r>
         <w:t xml:space="preserve"> </w:t>
@@ -4172,7 +4190,7 @@
       </w:r>
     </w:p>
     <w:bookmarkEnd w:id="32"/>
-    <w:bookmarkStart w:id="33" w:name="Xfe3c331420c241aa73c6296372277a6d3f913cb"/>
+    <w:bookmarkStart w:id="33" w:name="predicted-ip-curves"/>
     <w:p>
       <w:pPr>
         <w:pStyle w:val="Heading3"/>
@@ -4242,7 +4260,7 @@
           <w:bCs/>
           <w:b/>
         </w:rPr>
-        <w:t xml:space="preserve">Figure 3.</w:t>
+        <w:t xml:space="preserve">Figure 3.</w:t>
       </w:r>
       <w:r>
         <w:t xml:space="preserve"> </w:t>
@@ -4266,11 +4284,11 @@
         <w:t xml:space="preserve"> </w:t>
       </w:r>
       <w:r>
-        <w:t xml:space="preserve">shaded bands are 95 % pointwise CIs.</w:t>
+        <w:t xml:space="preserve">shaded bands are 95 % pointwise CIs.</w:t>
       </w:r>
     </w:p>
     <w:bookmarkEnd w:id="33"/>
-    <w:bookmarkStart w:id="34" w:name="X86f6006676d1e9a822b51b562b1655386d9e86b"/>
+    <w:bookmarkStart w:id="34" w:name="capability-moderation"/>
     <w:p>
       <w:pPr>
         <w:pStyle w:val="Heading3"/>
@@ -4382,15 +4400,15 @@
     <w:tbl>
       <w:tblPr>
         <w:tblStyle w:val="Table"/>
-        <w:tblW w:type="auto" w:w="0"/>
+        <w:tblW w:type="pct" w:w="5000"/>
         <w:tblLook w:firstRow="1" w:lastRow="0" w:firstColumn="0" w:lastColumn="0" w:noHBand="0" w:noVBand="0" w:val="0020"/>
         <w:jc w:val="start"/>
       </w:tblPr>
       <w:tblGrid>
-        <w:gridCol w:w="1980"/>
-        <w:gridCol w:w="1980"/>
-        <w:gridCol w:w="1980"/>
-        <w:gridCol w:w="1980"/>
+        <w:gridCol w:w="4601"/>
+        <w:gridCol w:w="1508"/>
+        <w:gridCol w:w="754"/>
+        <w:gridCol w:w="1056"/>
       </w:tblGrid>
       <w:tr>
         <w:trPr>
@@ -5175,7 +5193,7 @@
           <w:bCs/>
           <w:b/>
         </w:rPr>
-        <w:t xml:space="preserve">Figure 4.</w:t>
+        <w:t xml:space="preserve">Figure 4.</w:t>
       </w:r>
       <w:r>
         <w:t xml:space="preserve"> </w:t>
@@ -5193,7 +5211,7 @@
         <w:t xml:space="preserve"> </w:t>
       </w:r>
       <w:r>
-        <w:t xml:space="preserve">Chinese private firms. Error bars are 95 % HC1-robust confidence</w:t>
+        <w:t xml:space="preserve">Chinese private firms. Error bars are 95 % HC1-robust confidence</w:t>
       </w:r>
       <w:r>
         <w:t xml:space="preserve"> </w:t>
@@ -5209,7 +5227,7 @@
       </w:r>
     </w:p>
     <w:bookmarkEnd w:id="34"/>
-    <w:bookmarkStart w:id="35" w:name="Xdf31b4a83ae47f030a08265332b3138989411fc"/>
+    <w:bookmarkStart w:id="35" w:name="mechanism-analysis-digital-adoption"/>
     <w:p>
       <w:pPr>
         <w:pStyle w:val="Heading3"/>
@@ -5241,13 +5259,13 @@
         <w:t xml:space="preserve"> </w:t>
       </w:r>
       <w:r>
-        <w:t xml:space="preserve">DAI_core mediates the TCI_full → lnLP relationship via a sequential</w:t>
-      </w:r>
-      <w:r>
-        <w:t xml:space="preserve"> </w:t>
-      </w:r>
-      <w:r>
-        <w:t xml:space="preserve">mediation path (TCI_full → DAI_core → lnLP). Bootstrap indirect-effect</w:t>
+        <w:t xml:space="preserve">DAI_core mediates the TCI_full to lnLP relationship via a sequential</w:t>
+      </w:r>
+      <w:r>
+        <w:t xml:space="preserve"> </w:t>
+      </w:r>
+      <w:r>
+        <w:t xml:space="preserve">mediation path (TCI_full to DAI_core to lnLP). Bootstrap indirect-effect</w:t>
       </w:r>
       <w:r>
         <w:t xml:space="preserve"> </w:t>
@@ -5259,7 +5277,7 @@
         <w:t xml:space="preserve"> </w:t>
       </w:r>
       <w:r>
-        <w:t xml:space="preserve">(2012: +0.018, 95 % CI [0.004, 0.039]; 2024: +0.022, 95 % CI [0.007,</w:t>
+        <w:t xml:space="preserve">(2012: +0.018, 95 % CI [0.004, 0.039]; 2024: +0.022, 95 % CI [0.007,</w:t>
       </w:r>
       <w:r>
         <w:t xml:space="preserve"> </w:t>
@@ -5283,7 +5301,25 @@
         <w:t xml:space="preserve"> </w:t>
       </w:r>
       <w:r>
-        <w:t xml:space="preserve">reported as a “descriptive mechanism sketch” rather than a causal</w:t>
+        <w:t xml:space="preserve">reported as a</w:t>
+      </w:r>
+      <w:r>
+        <w:t xml:space="preserve"> </w:t>
+      </w:r>
+      <w:r>
+        <w:t xml:space="preserve">“</w:t>
+      </w:r>
+      <w:r>
+        <w:t xml:space="preserve">descriptive mechanism sketch</w:t>
+      </w:r>
+      <w:r>
+        <w:t xml:space="preserve">”</w:t>
+      </w:r>
+      <w:r>
+        <w:t xml:space="preserve"> </w:t>
+      </w:r>
+      <w:r>
+        <w:t xml:space="preserve">rather than a causal</w:t>
       </w:r>
       <w:r>
         <w:t xml:space="preserve"> </w:t>
@@ -5293,7 +5329,7 @@
       </w:r>
     </w:p>
     <w:bookmarkEnd w:id="35"/>
-    <w:bookmarkStart w:id="36" w:name="X7b68f907ed55e65a2ee44288bf21fafeaedb955"/>
+    <w:bookmarkStart w:id="36" w:name="robustness-checks"/>
     <w:p>
       <w:pPr>
         <w:pStyle w:val="Heading3"/>
@@ -5329,7 +5365,7 @@
         <w:t xml:space="preserve"> </w:t>
       </w:r>
       <w:r>
-        <w:t xml:space="preserve">turning points of 48.1 % (2012) and 46.4 % (2024), within the confidence</w:t>
+        <w:t xml:space="preserve">turning points of 48.1 % (2012) and 46.4 % (2024), within the confidence</w:t>
       </w:r>
       <w:r>
         <w:t xml:space="preserve"> </w:t>
@@ -5377,7 +5413,7 @@
         <w:t xml:space="preserve"> </w:t>
       </w:r>
       <w:r>
-        <w:t xml:space="preserve">with a turning point of 47.9 % in 2012 and 45.7 % in 2024. Paternoster</w:t>
+        <w:t xml:space="preserve">with a turning point of 47.9 % in 2012 and 45.7 % in 2024. Paternoster</w:t>
       </w:r>
       <w:r>
         <w:t xml:space="preserve"> </w:t>
@@ -5413,7 +5449,7 @@
         <w:t xml:space="preserve"> </w:t>
       </w:r>
       <w:r>
-        <w:t xml:space="preserve">the turning point ranging from 44.8 % to 51.3 % across quantiles and</w:t>
+        <w:t xml:space="preserve">the turning point ranging from 44.8 % to 51.3 % across quantiles and</w:t>
       </w:r>
       <w:r>
         <w:t xml:space="preserve"> </w:t>
@@ -5496,7 +5532,7 @@
     </w:p>
     <w:bookmarkEnd w:id="36"/>
     <w:bookmarkEnd w:id="37"/>
-    <w:bookmarkStart w:id="43" w:name="X735612638e4e736e4693e459c258977262c0dfc"/>
+    <w:bookmarkStart w:id="43" w:name="discussion"/>
     <w:p>
       <w:pPr>
         <w:pStyle w:val="Heading2"/>
@@ -5505,7 +5541,7 @@
         <w:t xml:space="preserve">5. Discussion</w:t>
       </w:r>
     </w:p>
-    <w:bookmarkStart w:id="38" w:name="Xa0c03496b4c04a1649263a3e01d0b00bd039955"/>
+    <w:bookmarkStart w:id="38" w:name="temporal-stability-of-the-ip-threshold"/>
     <w:p>
       <w:pPr>
         <w:pStyle w:val="Heading3"/>
@@ -5525,19 +5561,19 @@
         <w:t xml:space="preserve"> </w:t>
       </w:r>
       <w:r>
-        <w:t xml:space="preserve">private firms is structurally durable. Turning points of 49.4 % (2012)</w:t>
-      </w:r>
-      <w:r>
-        <w:t xml:space="preserve"> </w:t>
-      </w:r>
-      <w:r>
-        <w:t xml:space="preserve">and 47.2 % (2024) are statistically indistinguishable by the Paternoster</w:t>
-      </w:r>
-      <w:r>
-        <w:t xml:space="preserve"> </w:t>
-      </w:r>
-      <w:r>
-        <w:t xml:space="preserve">test, and the pooled estimate (48.8 %) sits within both wave-specific</w:t>
+        <w:t xml:space="preserve">private firms is structurally durable. Turning points of 49.4 % (2012)</w:t>
+      </w:r>
+      <w:r>
+        <w:t xml:space="preserve"> </w:t>
+      </w:r>
+      <w:r>
+        <w:t xml:space="preserve">and 47.2 % (2024) are statistically indistinguishable by the Paternoster</w:t>
+      </w:r>
+      <w:r>
+        <w:t xml:space="preserve"> </w:t>
+      </w:r>
+      <w:r>
+        <w:t xml:space="preserve">test, and the pooled estimate (48.8 %) sits within both wave-specific</w:t>
       </w:r>
       <w:r>
         <w:t xml:space="preserve"> </w:t>
@@ -5567,7 +5603,7 @@
         <w:t xml:space="preserve"> </w:t>
       </w:r>
       <w:r>
-        <w:t xml:space="preserve">(2007) meta-analytic evidence and Marano et al. (2016) institutional</w:t>
+        <w:t xml:space="preserve">(2007) meta-analytic evidence and Marano et al. (2016) institutional</w:t>
       </w:r>
       <w:r>
         <w:t xml:space="preserve"> </w:t>
@@ -5593,7 +5629,7 @@
         <w:pStyle w:val="BodyText"/>
       </w:pPr>
       <w:r>
-        <w:t xml:space="preserve">For Chinese private firms, the threshold around 48 % export intensity</w:t>
+        <w:t xml:space="preserve">For Chinese private firms, the threshold around 48 % export intensity</w:t>
       </w:r>
       <w:r>
         <w:t xml:space="preserve"> </w:t>
@@ -5633,7 +5669,7 @@
       </w:r>
     </w:p>
     <w:bookmarkEnd w:id="38"/>
-    <w:bookmarkStart w:id="39" w:name="X662147d669ae611953db259d7b4d93f76a97e61"/>
+    <w:bookmarkStart w:id="39" w:name="X433fb1e034c39d563b08fc3391a6162a4e2331e"/>
     <w:p>
       <w:pPr>
         <w:pStyle w:val="Heading3"/>
@@ -5695,7 +5731,22 @@
         <w:t xml:space="preserve"> </w:t>
       </w:r>
       <w:r>
-        <w:t xml:space="preserve">a curvature-moderator to a “level-shifter”: capability elevates</w:t>
+        <w:t xml:space="preserve">a curvature-moderator to a</w:t>
+      </w:r>
+      <w:r>
+        <w:t xml:space="preserve"> </w:t>
+      </w:r>
+      <w:r>
+        <w:t xml:space="preserve">“</w:t>
+      </w:r>
+      <w:r>
+        <w:t xml:space="preserve">level-shifter</w:t>
+      </w:r>
+      <w:r>
+        <w:t xml:space="preserve">”</w:t>
+      </w:r>
+      <w:r>
+        <w:t xml:space="preserve">: capability elevates</w:t>
       </w:r>
       <w:r>
         <w:t xml:space="preserve"> </w:t>
@@ -5739,7 +5790,7 @@
         <w:pStyle w:val="BodyText"/>
       </w:pPr>
       <w:r>
-        <w:t xml:space="preserve">This finding is consistent with Avenyo et al. (2021), who find that</w:t>
+        <w:t xml:space="preserve">This finding is consistent with Avenyo et al. (2021), who find that</w:t>
       </w:r>
       <w:r>
         <w:t xml:space="preserve"> </w:t>
@@ -5789,7 +5840,7 @@
         <w:t xml:space="preserve"> </w:t>
       </w:r>
       <w:r>
-        <w:t xml:space="preserve">without moderating the I→P slope). This pattern emerges across two</w:t>
+        <w:t xml:space="preserve">without moderating the I to P slope). This pattern emerges across two</w:t>
       </w:r>
       <w:r>
         <w:t xml:space="preserve"> </w:t>
@@ -5841,7 +5892,7 @@
       </w:r>
     </w:p>
     <w:bookmarkEnd w:id="39"/>
-    <w:bookmarkStart w:id="40" w:name="Xeab358fda242154d2e818677c8845f988021d48"/>
+    <w:bookmarkStart w:id="40" w:name="digital-adoption-as-baseline-control"/>
     <w:p>
       <w:pPr>
         <w:pStyle w:val="Heading3"/>
@@ -5867,13 +5918,13 @@
         <w:t xml:space="preserve"> </w:t>
       </w:r>
       <w:r>
-        <w:t xml:space="preserve">TCI_full. The mechanism sketch (§4.5) suggests a partial mediation</w:t>
-      </w:r>
-      <w:r>
-        <w:t xml:space="preserve"> </w:t>
-      </w:r>
-      <w:r>
-        <w:t xml:space="preserve">pathway (TCI → DAI → lnLP), but the effect is small and the</w:t>
+        <w:t xml:space="preserve">TCI_full. The mechanism sketch (Section 4.5) suggests a partial mediation</w:t>
+      </w:r>
+      <w:r>
+        <w:t xml:space="preserve"> </w:t>
+      </w:r>
+      <w:r>
+        <w:t xml:space="preserve">pathway (TCI to DAI to lnLP), but the effect is small and the</w:t>
       </w:r>
       <w:r>
         <w:t xml:space="preserve"> </w:t>
@@ -5919,7 +5970,7 @@
       </w:r>
     </w:p>
     <w:bookmarkEnd w:id="40"/>
-    <w:bookmarkStart w:id="41" w:name="X47b33dbf897054d79ce3d759da46f0a1ef21be8"/>
+    <w:bookmarkStart w:id="41" w:name="limitations"/>
     <w:p>
       <w:pPr>
         <w:pStyle w:val="Heading3"/>
@@ -5993,7 +6044,7 @@
         <w:t xml:space="preserve"> </w:t>
       </w:r>
       <w:r>
-        <w:t xml:space="preserve">robustness check (§4.6) partially addresses this concern, though it</w:t>
+        <w:t xml:space="preserve">robustness check (Section 4.6) partially addresses this concern, though it</w:t>
       </w:r>
       <w:r>
         <w:t xml:space="preserve"> </w:t>
@@ -6045,7 +6096,7 @@
       </w:r>
     </w:p>
     <w:bookmarkEnd w:id="41"/>
-    <w:bookmarkStart w:id="42" w:name="X6239b91c09f491af0efd332004cb71e9de7a16c"/>
+    <w:bookmarkStart w:id="42" w:name="future-research"/>
     <w:p>
       <w:pPr>
         <w:pStyle w:val="Heading3"/>
@@ -6113,7 +6164,7 @@
         <w:t xml:space="preserve"> </w:t>
       </w:r>
       <w:r>
-        <w:t xml:space="preserve">should note that a companion analysis (Đỗ and Phan, 2026) examines a</w:t>
+        <w:t xml:space="preserve">should note that a companion analysis (Authors, 2026) examines a</w:t>
       </w:r>
       <w:r>
         <w:t xml:space="preserve"> </w:t>
@@ -6136,7 +6187,7 @@
     </w:p>
     <w:bookmarkEnd w:id="42"/>
     <w:bookmarkEnd w:id="43"/>
-    <w:bookmarkStart w:id="44" w:name="X6b297cc947e0db5526be369b1f0f4ddc67b2415"/>
+    <w:bookmarkStart w:id="44" w:name="conclusion"/>
     <w:p>
       <w:pPr>
         <w:pStyle w:val="Heading2"/>
@@ -6168,13 +6219,13 @@
         <w:t xml:space="preserve"> </w:t>
       </w:r>
       <w:r>
-        <w:t xml:space="preserve">microdata for China (2012 and 2024), we find that turning points (49.4 %</w:t>
-      </w:r>
-      <w:r>
-        <w:t xml:space="preserve"> </w:t>
-      </w:r>
-      <w:r>
-        <w:t xml:space="preserve">and 47.2 %) are statistically indistinguishable across waves</w:t>
+        <w:t xml:space="preserve">microdata for China (2012 and 2024), we find that turning points (49.4 %</w:t>
+      </w:r>
+      <w:r>
+        <w:t xml:space="preserve"> </w:t>
+      </w:r>
+      <w:r>
+        <w:t xml:space="preserve">and 47.2 %) are statistically indistinguishable across waves</w:t>
       </w:r>
       <w:r>
         <w:t xml:space="preserve"> </w:t>
@@ -6264,14 +6315,12 @@
         <w:t xml:space="preserve"> </w:t>
       </w:r>
       <w:hyperlink r:id="rId45">
-        <w:hyperlink r:id="rId45">
-          <w:r>
-            <w:rPr>
-              <w:rStyle w:val="Hyperlink"/>
-            </w:rPr>
-            <w:t xml:space="preserve">www.enterprisesurveys.org</w:t>
-          </w:r>
-        </w:hyperlink>
+        <w:r>
+          <w:rPr>
+            <w:rStyle w:val="Hyperlink"/>
+          </w:rPr>
+          <w:t xml:space="preserve">www.enterprisesurveys.org</w:t>
+        </w:r>
       </w:hyperlink>
       <w:r>
         <w:t xml:space="preserve">. We thank</w:t>
@@ -6580,40 +6629,7 @@
         <w:pStyle w:val="BodyText"/>
       </w:pPr>
       <w:r>
-        <w:t xml:space="preserve">Do, T. H., and Phan, A. T. (2026). Unveiling the impact of Chinese</w:t>
-      </w:r>
-      <w:r>
-        <w:t xml:space="preserve"> </w:t>
-      </w:r>
-      <w:r>
-        <w:t xml:space="preserve">manufacturing SMEs' internationalization on performance.</w:t>
-      </w:r>
-      <w:r>
-        <w:t xml:space="preserve"> </w:t>
-      </w:r>
-      <w:r>
-        <w:rPr>
-          <w:iCs/>
-          <w:i/>
-        </w:rPr>
-        <w:t xml:space="preserve">Journal of</w:t>
-      </w:r>
-      <w:r>
-        <w:rPr>
-          <w:iCs/>
-          <w:i/>
-        </w:rPr>
-        <w:t xml:space="preserve"> </w:t>
-      </w:r>
-      <w:r>
-        <w:rPr>
-          <w:iCs/>
-          <w:i/>
-        </w:rPr>
-        <w:t xml:space="preserve">Finance and Accounting Research</w:t>
-      </w:r>
-      <w:r>
-        <w:t xml:space="preserve">. Advance online publication.</w:t>
+        <w:t xml:space="preserve">Authors. (2026). Details omitted for double-blind review.</w:t>
       </w:r>
     </w:p>
     <w:p>
@@ -7856,7 +7872,7 @@
           <w:iCs/>
           <w:i/>
         </w:rPr>
-        <w:t xml:space="preserve">, *</w:t>
+        <w:t xml:space="preserve">,</w:t>
       </w:r>
       <w:r>
         <w:rPr>
@@ -7866,199 +7882,219 @@
         <w:t xml:space="preserve"> </w:t>
       </w:r>
       <w:r>
+        <w:t xml:space="preserve"> </w:t>
+      </w:r>
+      <w:r>
         <w:rPr>
           <w:rStyle w:val="VerbatimChar"/>
+        </w:rPr>
+        <w:t xml:space="preserve">python/</w:t>
+      </w:r>
+      <w:r>
+        <w:rPr>
           <w:iCs/>
           <w:i/>
         </w:rPr>
-        <w:t xml:space="preserve">python/</w:t>
-      </w:r>
-      <w:r>
-        <w:t xml:space="preserve">, *</w:t>
-      </w:r>
-      <w:r>
-        <w:t xml:space="preserve"> </w:t>
-      </w:r>
-      <w:r>
-        <w:rPr>
-          <w:rStyle w:val="VerbatimChar"/>
-        </w:rPr>
-        <w:t xml:space="preserve">audit/</w:t>
+        <w:t xml:space="preserve">,</w:t>
       </w:r>
       <w:r>
         <w:rPr>
           <w:iCs/>
           <w:i/>
         </w:rPr>
-        <w:t xml:space="preserve">, *</w:t>
+        <w:t xml:space="preserve"> </w:t>
+      </w:r>
+      <w:r>
+        <w:t xml:space="preserve"> </w:t>
+      </w:r>
+      <w:r>
+        <w:rPr>
+          <w:rStyle w:val="VerbatimChar"/>
+        </w:rPr>
+        <w:t xml:space="preserve">audit/</w:t>
       </w:r>
       <w:r>
         <w:rPr>
           <w:iCs/>
           <w:i/>
         </w:rPr>
-        <w:t xml:space="preserve"> </w:t>
-      </w:r>
-      <w:r>
-        <w:rPr>
-          <w:rStyle w:val="VerbatimChar"/>
+        <w:t xml:space="preserve">,</w:t>
+      </w:r>
+      <w:r>
+        <w:rPr>
           <w:iCs/>
           <w:i/>
         </w:rPr>
+        <w:t xml:space="preserve"> </w:t>
+      </w:r>
+      <w:r>
+        <w:t xml:space="preserve"> </w:t>
+      </w:r>
+      <w:r>
+        <w:rPr>
+          <w:rStyle w:val="VerbatimChar"/>
+        </w:rPr>
         <w:t xml:space="preserve">results/</w:t>
-      </w:r>
-      <w:r>
-        <w:t xml:space="preserve">, and*</w:t>
-      </w:r>
-      <w:r>
-        <w:t xml:space="preserve"> </w:t>
-      </w:r>
-      <w:r>
-        <w:rPr>
-          <w:rStyle w:val="VerbatimChar"/>
-        </w:rPr>
-        <w:t xml:space="preserve">apjm/</w:t>
-      </w:r>
-      <w:r>
-        <w:t xml:space="preserve"> </w:t>
       </w:r>
       <w:r>
         <w:rPr>
           <w:iCs/>
           <w:i/>
         </w:rPr>
-        <w:t xml:space="preserve">subfolders.</w:t>
+        <w:t xml:space="preserve">, and</w:t>
+      </w:r>
+      <w:r>
+        <w:t xml:space="preserve"> </w:t>
+      </w:r>
+      <w:r>
+        <w:rPr>
+          <w:rStyle w:val="VerbatimChar"/>
+        </w:rPr>
+        <w:t xml:space="preserve">apjm/</w:t>
+      </w:r>
+      <w:r>
+        <w:t xml:space="preserve"> </w:t>
       </w:r>
       <w:r>
         <w:rPr>
           <w:iCs/>
           <w:i/>
         </w:rPr>
-        <w:t xml:space="preserve"> </w:t>
+        <w:t xml:space="preserve">subfolders.</w:t>
       </w:r>
       <w:r>
         <w:rPr>
           <w:iCs/>
           <w:i/>
         </w:rPr>
-        <w:t xml:space="preserve">The complete v1.8 manuscript is assembled from six section parts</w:t>
+        <w:t xml:space="preserve"> </w:t>
       </w:r>
       <w:r>
         <w:rPr>
           <w:iCs/>
           <w:i/>
         </w:rPr>
-        <w:t xml:space="preserve"> </w:t>
+        <w:t xml:space="preserve">The complete v1.8 manuscript is assembled from six section parts</w:t>
       </w:r>
       <w:r>
         <w:rPr>
           <w:iCs/>
           <w:i/>
         </w:rPr>
-        <w:t xml:space="preserve">(</w:t>
-      </w:r>
-      <w:r>
-        <w:rPr>
-          <w:rStyle w:val="VerbatimChar"/>
-        </w:rPr>
-        <w:t xml:space="preserve">apjm/manuscript_v1_8_blinded_part{1, 2, 3, 4, 5, 6}_*.md</w:t>
+        <w:t xml:space="preserve"> </w:t>
       </w:r>
       <w:r>
         <w:rPr>
           <w:iCs/>
           <w:i/>
         </w:rPr>
-        <w:t xml:space="preserve">) per the build</w:t>
+        <w:t xml:space="preserve">(</w:t>
+      </w:r>
+      <w:r>
+        <w:rPr>
+          <w:rStyle w:val="VerbatimChar"/>
+        </w:rPr>
+        <w:t xml:space="preserve">apjm/manuscript_v1_8_blinded_part{1, 2, 3, 4, 5, 6}_*.md</w:t>
       </w:r>
       <w:r>
         <w:rPr>
           <w:iCs/>
           <w:i/>
         </w:rPr>
-        <w:t xml:space="preserve"> </w:t>
+        <w:t xml:space="preserve">) per the build</w:t>
       </w:r>
       <w:r>
         <w:rPr>
           <w:iCs/>
           <w:i/>
         </w:rPr>
-        <w:t xml:space="preserve">script</w:t>
-      </w:r>
-      <w:r>
-        <w:t xml:space="preserve"> </w:t>
-      </w:r>
-      <w:r>
-        <w:rPr>
-          <w:rStyle w:val="VerbatimChar"/>
-        </w:rPr>
-        <w:t xml:space="preserve">apjm/build_docx.sh</w:t>
+        <w:t xml:space="preserve"> </w:t>
       </w:r>
       <w:r>
         <w:rPr>
           <w:iCs/>
           <w:i/>
         </w:rPr>
-        <w:t xml:space="preserve">. Full replication code (Stata + Python),</w:t>
+        <w:t xml:space="preserve">script</w:t>
+      </w:r>
+      <w:r>
+        <w:t xml:space="preserve"> </w:t>
+      </w:r>
+      <w:r>
+        <w:rPr>
+          <w:rStyle w:val="VerbatimChar"/>
+        </w:rPr>
+        <w:t xml:space="preserve">apjm/build_docx.sh</w:t>
       </w:r>
       <w:r>
         <w:rPr>
           <w:iCs/>
           <w:i/>
         </w:rPr>
-        <w:t xml:space="preserve"> </w:t>
+        <w:t xml:space="preserve">. Full replication code (Stata + Python),</w:t>
       </w:r>
       <w:r>
         <w:rPr>
           <w:iCs/>
           <w:i/>
         </w:rPr>
-        <w:t xml:space="preserve">audit tables, M0–M8 coefficients, three-way moderation results, citation</w:t>
+        <w:t xml:space="preserve"> </w:t>
       </w:r>
       <w:r>
         <w:rPr>
           <w:iCs/>
           <w:i/>
         </w:rPr>
-        <w:t xml:space="preserve"> </w:t>
+        <w:t xml:space="preserve">audit tables, M0–M8 coefficients, three-way moderation results, citation</w:t>
       </w:r>
       <w:r>
         <w:rPr>
           <w:iCs/>
           <w:i/>
         </w:rPr>
-        <w:t xml:space="preserve">verification (</w:t>
-      </w:r>
-      <w:r>
-        <w:rPr>
-          <w:rStyle w:val="VerbatimChar"/>
-        </w:rPr>
-        <w:t xml:space="preserve">apjm/VERIFICATION_RESULTS.md</w:t>
+        <w:t xml:space="preserve"> </w:t>
       </w:r>
       <w:r>
         <w:rPr>
           <w:iCs/>
           <w:i/>
         </w:rPr>
-        <w:t xml:space="preserve">), and figure-rendering</w:t>
+        <w:t xml:space="preserve">verification (</w:t>
+      </w:r>
+      <w:r>
+        <w:rPr>
+          <w:rStyle w:val="VerbatimChar"/>
+        </w:rPr>
+        <w:t xml:space="preserve">apjm/VERIFICATION_RESULTS.md</w:t>
       </w:r>
       <w:r>
         <w:rPr>
           <w:iCs/>
           <w:i/>
         </w:rPr>
-        <w:t xml:space="preserve"> </w:t>
+        <w:t xml:space="preserve">), and figure-rendering</w:t>
       </w:r>
       <w:r>
         <w:rPr>
           <w:iCs/>
           <w:i/>
         </w:rPr>
+        <w:t xml:space="preserve"> </w:t>
+      </w:r>
+      <w:r>
+        <w:rPr>
+          <w:iCs/>
+          <w:i/>
+        </w:rPr>
         <w:t xml:space="preserve">scripts are documented in the repository README.</w:t>
       </w:r>
     </w:p>
     <w:bookmarkEnd w:id="77"/>
     <w:bookmarkEnd w:id="78"/>
-    <w:sectPr/>
+    <w:sectPr>
+      <w:pgSz w:h="16838" w:w="11906"/>
+      <w:pgMar w:bottom="1417" w:left="1417" w:right="1417" w:top="1417"/>
+    </w:sectPr>
   </w:body>
 </w:document>
 </file>
@@ -8270,29 +8306,59 @@
   <w:style w:default="1" w:styleId="Normal" w:type="paragraph">
     <w:name w:val="Normal"/>
     <w:qFormat/>
+    <w:pPr>
+      <w:spacing w:line="276" w:lineRule="auto"/>
+      <w:jc w:val="both"/>
+    </w:pPr>
+    <w:rPr>
+      <w:rFonts w:ascii="Times New Roman" w:eastAsia="Times New Roman" w:hAnsi="Times New Roman"/>
+      <w:color w:val="000000"/>
+      <w:sz w:val="24"/>
+    </w:rPr>
   </w:style>
   <w:style w:styleId="BodyText" w:type="paragraph">
     <w:name w:val="Body Text"/>
     <w:basedOn w:val="Normal"/>
     <w:link w:val="BodyTextChar"/>
     <w:pPr>
-      <w:spacing w:after="180" w:before="180"/>
+      <w:spacing w:after="180" w:before="180" w:line="276" w:lineRule="auto"/>
+      <w:jc w:val="both"/>
     </w:pPr>
     <w:qFormat/>
+    <w:rPr>
+      <w:rFonts w:ascii="Times New Roman" w:eastAsia="Times New Roman" w:hAnsi="Times New Roman"/>
+      <w:color w:val="000000"/>
+      <w:sz w:val="24"/>
+    </w:rPr>
   </w:style>
   <w:style w:customStyle="1" w:styleId="FirstParagraph" w:type="paragraph">
     <w:name w:val="First Paragraph"/>
     <w:basedOn w:val="BodyText"/>
     <w:next w:val="BodyText"/>
     <w:qFormat/>
+    <w:pPr>
+      <w:spacing w:line="276" w:lineRule="auto"/>
+      <w:jc w:val="both"/>
+    </w:pPr>
+    <w:rPr>
+      <w:rFonts w:ascii="Times New Roman" w:eastAsia="Times New Roman" w:hAnsi="Times New Roman"/>
+      <w:color w:val="000000"/>
+      <w:sz w:val="24"/>
+    </w:rPr>
   </w:style>
   <w:style w:customStyle="1" w:styleId="Compact" w:type="paragraph">
     <w:name w:val="Compact"/>
     <w:basedOn w:val="BodyText"/>
     <w:qFormat/>
     <w:pPr>
-      <w:spacing w:after="36" w:before="36"/>
+      <w:spacing w:after="36" w:before="36" w:line="276" w:lineRule="auto"/>
+      <w:jc w:val="both"/>
     </w:pPr>
+    <w:rPr>
+      <w:rFonts w:ascii="Times New Roman" w:eastAsia="Times New Roman" w:hAnsi="Times New Roman"/>
+      <w:color w:val="000000"/>
+      <w:sz w:val="24"/>
+    </w:rPr>
   </w:style>
   <w:style w:styleId="Title" w:type="paragraph">
     <w:name w:val="Title"/>
@@ -8302,15 +8368,15 @@
     <w:pPr>
       <w:keepNext/>
       <w:keepLines/>
-      <w:spacing w:after="240" w:before="480"/>
-      <w:jc w:val="center"/>
+      <w:spacing w:after="240" w:before="480" w:line="276" w:lineRule="auto"/>
+      <w:jc w:val="both"/>
     </w:pPr>
     <w:rPr>
-      <w:rFonts w:asciiTheme="majorHAnsi" w:cstheme="majorBidi" w:eastAsiaTheme="majorEastAsia" w:hAnsiTheme="majorHAnsi"/>
+      <w:rFonts w:ascii="Times New Roman" w:asciiTheme="majorHAnsi" w:cstheme="majorBidi" w:eastAsia="Times New Roman" w:eastAsiaTheme="majorEastAsia" w:hAnsi="Times New Roman" w:hAnsiTheme="majorHAnsi"/>
       <w:b/>
       <w:bCs/>
-      <w:color w:themeColor="accent1" w:themeShade="B5" w:val="345A8A"/>
-      <w:sz w:val="36"/>
+      <w:color w:val="000000"/>
+      <w:sz w:val="24"/>
       <w:szCs w:val="36"/>
     </w:rPr>
   </w:style>
@@ -8322,11 +8388,13 @@
     <w:pPr>
       <w:keepNext/>
       <w:keepLines/>
-      <w:spacing w:after="240" w:before="240"/>
-      <w:jc w:val="center"/>
+      <w:spacing w:after="240" w:before="240" w:line="276" w:lineRule="auto"/>
+      <w:jc w:val="both"/>
     </w:pPr>
     <w:rPr>
-      <w:sz w:val="30"/>
+      <w:rFonts w:ascii="Times New Roman" w:eastAsia="Times New Roman" w:hAnsi="Times New Roman"/>
+      <w:color w:val="000000"/>
+      <w:sz w:val="24"/>
       <w:szCs w:val="30"/>
     </w:rPr>
   </w:style>
@@ -8337,8 +8405,14 @@
     <w:pPr>
       <w:keepNext/>
       <w:keepLines/>
-      <w:jc w:val="center"/>
+      <w:spacing w:line="276" w:lineRule="auto"/>
+      <w:jc w:val="both"/>
     </w:pPr>
+    <w:rPr>
+      <w:rFonts w:ascii="Times New Roman" w:eastAsia="Times New Roman" w:hAnsi="Times New Roman"/>
+      <w:color w:val="000000"/>
+      <w:sz w:val="24"/>
+    </w:rPr>
   </w:style>
   <w:style w:styleId="Date" w:type="paragraph">
     <w:name w:val="Date"/>
@@ -8347,8 +8421,14 @@
     <w:pPr>
       <w:keepNext/>
       <w:keepLines/>
-      <w:jc w:val="center"/>
+      <w:spacing w:line="276" w:lineRule="auto"/>
+      <w:jc w:val="both"/>
     </w:pPr>
+    <w:rPr>
+      <w:rFonts w:ascii="Times New Roman" w:eastAsia="Times New Roman" w:hAnsi="Times New Roman"/>
+      <w:color w:val="000000"/>
+      <w:sz w:val="24"/>
+    </w:rPr>
   </w:style>
   <w:style w:customStyle="1" w:styleId="AbstractTitle" w:type="paragraph">
     <w:name w:val="Abstract Title"/>
@@ -8358,15 +8438,15 @@
     <w:pPr>
       <w:keepNext/>
       <w:keepLines/>
-      <w:jc w:val="center"/>
-      <w:spacing w:after="0" w:before="300"/>
+      <w:jc w:val="both"/>
+      <w:spacing w:after="0" w:before="300" w:line="276" w:lineRule="auto"/>
     </w:pPr>
     <w:rPr>
-      <w:sz w:val="20"/>
+      <w:color w:val="000000"/>
+      <w:sz w:val="24"/>
       <w:szCs w:val="20"/>
+      <w:rFonts w:ascii="Times New Roman" w:eastAsia="Times New Roman" w:hAnsi="Times New Roman"/>
       <w:b/>
-      <w:color w:val="345A8A"/>
-      &gt;
     </w:rPr>
   </w:style>
   <w:style w:customStyle="1" w:styleId="Abstract" w:type="paragraph">
@@ -8377,10 +8457,13 @@
     <w:pPr>
       <w:keepNext/>
       <w:keepLines/>
-      <w:spacing w:after="300" w:before="100"/>
+      <w:spacing w:after="300" w:before="100" w:line="276" w:lineRule="auto"/>
+      <w:jc w:val="both"/>
     </w:pPr>
     <w:rPr>
-      <w:sz w:val="20"/>
+      <w:rFonts w:ascii="Times New Roman" w:eastAsia="Times New Roman" w:hAnsi="Times New Roman"/>
+      <w:color w:val="000000"/>
+      <w:sz w:val="24"/>
       <w:szCs w:val="20"/>
     </w:rPr>
   </w:style>
@@ -8389,8 +8472,15 @@
     <w:basedOn w:val="Normal"/>
     <w:next w:val="Bibliography"/>
     <w:qFormat/>
-    <w:pPr/>
-    <w:rPr/>
+    <w:pPr>
+      <w:spacing w:line="276" w:lineRule="auto"/>
+      <w:jc w:val="both"/>
+    </w:pPr>
+    <w:rPr>
+      <w:rFonts w:ascii="Times New Roman" w:eastAsia="Times New Roman" w:hAnsi="Times New Roman"/>
+      <w:color w:val="000000"/>
+      <w:sz w:val="24"/>
+    </w:rPr>
   </w:style>
   <w:style w:styleId="Heading1" w:type="paragraph">
     <w:name w:val="Heading 1"/>
@@ -8401,15 +8491,16 @@
     <w:pPr>
       <w:keepNext/>
       <w:keepLines/>
-      <w:spacing w:after="0" w:before="480"/>
+      <w:spacing w:after="0" w:before="480" w:line="276" w:lineRule="auto"/>
+      <w:jc w:val="both"/>
       <w:outlineLvl w:val="0"/>
     </w:pPr>
     <w:rPr>
-      <w:rFonts w:asciiTheme="majorHAnsi" w:cstheme="majorBidi" w:eastAsiaTheme="majorEastAsia" w:hAnsiTheme="majorHAnsi"/>
+      <w:rFonts w:ascii="Times New Roman" w:asciiTheme="majorHAnsi" w:cstheme="majorBidi" w:eastAsia="Times New Roman" w:eastAsiaTheme="majorEastAsia" w:hAnsi="Times New Roman" w:hAnsiTheme="majorHAnsi"/>
       <w:b/>
       <w:bCs/>
-      <w:color w:themeColor="accent1" w:val="4F81BD"/>
-      <w:sz w:val="32"/>
+      <w:color w:val="000000"/>
+      <w:sz w:val="24"/>
       <w:szCs w:val="32"/>
     </w:rPr>
   </w:style>
@@ -8423,15 +8514,16 @@
     <w:pPr>
       <w:keepNext/>
       <w:keepLines/>
-      <w:spacing w:after="0" w:before="200"/>
+      <w:spacing w:after="0" w:before="200" w:line="276" w:lineRule="auto"/>
+      <w:jc w:val="both"/>
       <w:outlineLvl w:val="1"/>
     </w:pPr>
     <w:rPr>
-      <w:rFonts w:asciiTheme="majorHAnsi" w:cstheme="majorBidi" w:eastAsiaTheme="majorEastAsia" w:hAnsiTheme="majorHAnsi"/>
+      <w:rFonts w:ascii="Times New Roman" w:asciiTheme="majorHAnsi" w:cstheme="majorBidi" w:eastAsia="Times New Roman" w:eastAsiaTheme="majorEastAsia" w:hAnsi="Times New Roman" w:hAnsiTheme="majorHAnsi"/>
       <w:b/>
       <w:bCs/>
-      <w:color w:themeColor="accent1" w:val="4F81BD"/>
-      <w:sz w:val="28"/>
+      <w:color w:val="000000"/>
+      <w:sz w:val="24"/>
       <w:szCs w:val="28"/>
     </w:rPr>
   </w:style>
@@ -8445,14 +8537,15 @@
     <w:pPr>
       <w:keepNext/>
       <w:keepLines/>
-      <w:spacing w:after="0" w:before="200"/>
+      <w:spacing w:after="0" w:before="200" w:line="276" w:lineRule="auto"/>
+      <w:jc w:val="both"/>
       <w:outlineLvl w:val="2"/>
     </w:pPr>
     <w:rPr>
-      <w:rFonts w:asciiTheme="majorHAnsi" w:cstheme="majorBidi" w:eastAsiaTheme="majorEastAsia" w:hAnsiTheme="majorHAnsi"/>
+      <w:rFonts w:ascii="Times New Roman" w:asciiTheme="majorHAnsi" w:cstheme="majorBidi" w:eastAsia="Times New Roman" w:eastAsiaTheme="majorEastAsia" w:hAnsi="Times New Roman" w:hAnsiTheme="majorHAnsi"/>
       <w:b/>
       <w:bCs/>
-      <w:color w:themeColor="accent1" w:val="4F81BD"/>
+      <w:color w:val="000000"/>
       <w:sz w:val="24"/>
       <w:szCs w:val="24"/>
     </w:rPr>
@@ -8467,14 +8560,15 @@
     <w:pPr>
       <w:keepNext/>
       <w:keepLines/>
-      <w:spacing w:after="0" w:before="200"/>
+      <w:spacing w:after="0" w:before="200" w:line="276" w:lineRule="auto"/>
+      <w:jc w:val="both"/>
       <w:outlineLvl w:val="3"/>
     </w:pPr>
     <w:rPr>
-      <w:rFonts w:asciiTheme="majorHAnsi" w:cstheme="majorBidi" w:eastAsiaTheme="majorEastAsia" w:hAnsiTheme="majorHAnsi"/>
+      <w:rFonts w:ascii="Times New Roman" w:asciiTheme="majorHAnsi" w:cstheme="majorBidi" w:eastAsia="Times New Roman" w:eastAsiaTheme="majorEastAsia" w:hAnsi="Times New Roman" w:hAnsiTheme="majorHAnsi"/>
       <w:i/>
       <w:bCs/>
-      <w:color w:themeColor="accent1" w:val="4F81BD"/>
+      <w:color w:val="000000"/>
       <w:sz w:val="24"/>
       <w:szCs w:val="24"/>
     </w:rPr>
@@ -8489,13 +8583,14 @@
     <w:pPr>
       <w:keepNext/>
       <w:keepLines/>
-      <w:spacing w:after="0" w:before="200"/>
+      <w:spacing w:after="0" w:before="200" w:line="276" w:lineRule="auto"/>
+      <w:jc w:val="both"/>
       <w:outlineLvl w:val="4"/>
     </w:pPr>
     <w:rPr>
-      <w:rFonts w:asciiTheme="majorHAnsi" w:cstheme="majorBidi" w:eastAsiaTheme="majorEastAsia" w:hAnsiTheme="majorHAnsi"/>
+      <w:rFonts w:ascii="Times New Roman" w:asciiTheme="majorHAnsi" w:cstheme="majorBidi" w:eastAsia="Times New Roman" w:eastAsiaTheme="majorEastAsia" w:hAnsi="Times New Roman" w:hAnsiTheme="majorHAnsi"/>
       <w:iCs/>
-      <w:color w:themeColor="accent1" w:val="4F81BD"/>
+      <w:color w:val="000000"/>
       <w:sz w:val="24"/>
       <w:szCs w:val="24"/>
     </w:rPr>
@@ -8510,12 +8605,13 @@
     <w:pPr>
       <w:keepNext/>
       <w:keepLines/>
-      <w:spacing w:after="0" w:before="200"/>
+      <w:spacing w:after="0" w:before="200" w:line="276" w:lineRule="auto"/>
+      <w:jc w:val="both"/>
       <w:outlineLvl w:val="5"/>
     </w:pPr>
     <w:rPr>
-      <w:rFonts w:asciiTheme="majorHAnsi" w:cstheme="majorBidi" w:eastAsiaTheme="majorEastAsia" w:hAnsiTheme="majorHAnsi"/>
-      <w:color w:themeColor="accent1" w:val="4F81BD"/>
+      <w:rFonts w:ascii="Times New Roman" w:asciiTheme="majorHAnsi" w:cstheme="majorBidi" w:eastAsia="Times New Roman" w:eastAsiaTheme="majorEastAsia" w:hAnsi="Times New Roman" w:hAnsiTheme="majorHAnsi"/>
+      <w:color w:val="000000"/>
       <w:sz w:val="24"/>
       <w:szCs w:val="24"/>
     </w:rPr>
@@ -8530,12 +8626,13 @@
     <w:pPr>
       <w:keepNext/>
       <w:keepLines/>
-      <w:spacing w:after="0" w:before="200"/>
+      <w:spacing w:after="0" w:before="200" w:line="276" w:lineRule="auto"/>
+      <w:jc w:val="both"/>
       <w:outlineLvl w:val="6"/>
     </w:pPr>
     <w:rPr>
-      <w:rFonts w:asciiTheme="majorHAnsi" w:cstheme="majorBidi" w:eastAsiaTheme="majorEastAsia" w:hAnsiTheme="majorHAnsi"/>
-      <w:color w:themeColor="accent1" w:val="4F81BD"/>
+      <w:rFonts w:ascii="Times New Roman" w:asciiTheme="majorHAnsi" w:cstheme="majorBidi" w:eastAsia="Times New Roman" w:eastAsiaTheme="majorEastAsia" w:hAnsi="Times New Roman" w:hAnsiTheme="majorHAnsi"/>
+      <w:color w:val="000000"/>
       <w:sz w:val="24"/>
       <w:szCs w:val="24"/>
     </w:rPr>
@@ -8550,12 +8647,13 @@
     <w:pPr>
       <w:keepNext/>
       <w:keepLines/>
-      <w:spacing w:after="0" w:before="200"/>
+      <w:spacing w:after="0" w:before="200" w:line="276" w:lineRule="auto"/>
+      <w:jc w:val="both"/>
       <w:outlineLvl w:val="7"/>
     </w:pPr>
     <w:rPr>
-      <w:rFonts w:asciiTheme="majorHAnsi" w:cstheme="majorBidi" w:eastAsiaTheme="majorEastAsia" w:hAnsiTheme="majorHAnsi"/>
-      <w:color w:themeColor="accent1" w:val="4F81BD"/>
+      <w:rFonts w:ascii="Times New Roman" w:asciiTheme="majorHAnsi" w:cstheme="majorBidi" w:eastAsia="Times New Roman" w:eastAsiaTheme="majorEastAsia" w:hAnsi="Times New Roman" w:hAnsiTheme="majorHAnsi"/>
+      <w:color w:val="000000"/>
       <w:sz w:val="24"/>
       <w:szCs w:val="24"/>
     </w:rPr>
@@ -8570,12 +8668,13 @@
     <w:pPr>
       <w:keepNext/>
       <w:keepLines/>
-      <w:spacing w:after="0" w:before="200"/>
+      <w:spacing w:after="0" w:before="200" w:line="276" w:lineRule="auto"/>
+      <w:jc w:val="both"/>
       <w:outlineLvl w:val="8"/>
     </w:pPr>
     <w:rPr>
-      <w:rFonts w:asciiTheme="majorHAnsi" w:cstheme="majorBidi" w:eastAsiaTheme="majorEastAsia" w:hAnsiTheme="majorHAnsi"/>
-      <w:color w:themeColor="accent1" w:val="4F81BD"/>
+      <w:rFonts w:ascii="Times New Roman" w:asciiTheme="majorHAnsi" w:cstheme="majorBidi" w:eastAsia="Times New Roman" w:eastAsiaTheme="majorEastAsia" w:hAnsi="Times New Roman" w:hAnsiTheme="majorHAnsi"/>
+      <w:color w:val="000000"/>
       <w:sz w:val="24"/>
       <w:szCs w:val="24"/>
     </w:rPr>
@@ -8588,9 +8687,15 @@
     <w:unhideWhenUsed/>
     <w:qFormat/>
     <w:pPr>
-      <w:spacing w:after="100" w:before="100"/>
+      <w:spacing w:after="100" w:before="100" w:line="276" w:lineRule="auto"/>
       <w:ind w:firstLine="0" w:left="480" w:right="480"/>
+      <w:jc w:val="both"/>
     </w:pPr>
+    <w:rPr>
+      <w:rFonts w:ascii="Times New Roman" w:eastAsia="Times New Roman" w:hAnsi="Times New Roman"/>
+      <w:color w:val="000000"/>
+      <w:sz w:val="24"/>
+    </w:rPr>
   </w:style>
   <w:style w:styleId="FootnoteText" w:type="paragraph">
     <w:name w:val="Footnote Text"/>
@@ -8599,11 +8704,25 @@
     <w:uiPriority w:val="9"/>
     <w:unhideWhenUsed/>
     <w:qFormat/>
+    <w:pPr>
+      <w:spacing w:line="276" w:lineRule="auto"/>
+      <w:jc w:val="both"/>
+    </w:pPr>
+    <w:rPr>
+      <w:rFonts w:ascii="Times New Roman" w:eastAsia="Times New Roman" w:hAnsi="Times New Roman"/>
+      <w:color w:val="000000"/>
+      <w:sz w:val="24"/>
+    </w:rPr>
   </w:style>
   <w:style w:default="1" w:styleId="DefaultParagraphFont" w:type="character">
     <w:name w:val="Default Paragraph Font"/>
     <w:semiHidden/>
     <w:unhideWhenUsed/>
+    <w:rPr>
+      <w:rFonts w:ascii="Times New Roman" w:eastAsia="Times New Roman" w:hAnsi="Times New Roman"/>
+      <w:color w:val="000000"/>
+      <w:sz w:val="24"/>
+    </w:rPr>
   </w:style>
   <w:style w:default="1" w:styleId="Table" w:type="table">
     <w:name w:val="Table"/>
@@ -8611,6 +8730,15 @@
     <w:semiHidden/>
     <w:unhideWhenUsed/>
     <w:qFormat/>
+    <w:pPr>
+      <w:spacing w:line="276" w:lineRule="auto"/>
+      <w:jc w:val="both"/>
+    </w:pPr>
+    <w:rPr>
+      <w:rFonts w:ascii="Times New Roman" w:eastAsia="Times New Roman" w:hAnsi="Times New Roman"/>
+      <w:color w:val="000000"/>
+      <w:sz w:val="24"/>
+    </w:rPr>
     <w:tblPr>
       <w:tblInd w:type="dxa" w:w="0"/>
       <w:tblCellMar>
@@ -8643,25 +8771,42 @@
     <w:pPr>
       <w:keepNext/>
       <w:keepLines/>
-      <w:spacing w:after="0"/>
+      <w:spacing w:after="0" w:line="276" w:lineRule="auto"/>
+      <w:jc w:val="both"/>
     </w:pPr>
     <w:rPr>
+      <w:rFonts w:ascii="Times New Roman" w:eastAsia="Times New Roman" w:hAnsi="Times New Roman"/>
       <w:b/>
+      <w:color w:val="000000"/>
+      <w:sz w:val="24"/>
     </w:rPr>
   </w:style>
   <w:style w:customStyle="1" w:styleId="Definition" w:type="paragraph">
     <w:name w:val="Definition"/>
     <w:basedOn w:val="Normal"/>
+    <w:pPr>
+      <w:spacing w:line="276" w:lineRule="auto"/>
+      <w:jc w:val="both"/>
+    </w:pPr>
+    <w:rPr>
+      <w:rFonts w:ascii="Times New Roman" w:eastAsia="Times New Roman" w:hAnsi="Times New Roman"/>
+      <w:color w:val="000000"/>
+      <w:sz w:val="24"/>
+    </w:rPr>
   </w:style>
   <w:style w:styleId="Caption" w:type="paragraph">
     <w:name w:val="Caption"/>
     <w:basedOn w:val="Normal"/>
     <w:link w:val="BodyTextChar"/>
     <w:pPr>
-      <w:spacing w:after="120" w:before="0"/>
+      <w:spacing w:after="120" w:before="0" w:line="276" w:lineRule="auto"/>
+      <w:jc w:val="both"/>
     </w:pPr>
     <w:rPr>
+      <w:rFonts w:ascii="Times New Roman" w:eastAsia="Times New Roman" w:hAnsi="Times New Roman"/>
       <w:i/>
+      <w:color w:val="000000"/>
+      <w:sz w:val="24"/>
     </w:rPr>
   </w:style>
   <w:style w:customStyle="1" w:styleId="TableCaption" w:type="paragraph">
@@ -8669,44 +8814,90 @@
     <w:basedOn w:val="Caption"/>
     <w:pPr>
       <w:keepNext/>
+      <w:spacing w:line="276" w:lineRule="auto"/>
+      <w:jc w:val="both"/>
     </w:pPr>
+    <w:rPr>
+      <w:rFonts w:ascii="Times New Roman" w:eastAsia="Times New Roman" w:hAnsi="Times New Roman"/>
+      <w:color w:val="000000"/>
+      <w:sz w:val="24"/>
+    </w:rPr>
   </w:style>
   <w:style w:customStyle="1" w:styleId="ImageCaption" w:type="paragraph">
     <w:name w:val="Image Caption"/>
     <w:basedOn w:val="Caption"/>
+    <w:pPr>
+      <w:spacing w:line="276" w:lineRule="auto"/>
+      <w:jc w:val="both"/>
+    </w:pPr>
+    <w:rPr>
+      <w:rFonts w:ascii="Times New Roman" w:eastAsia="Times New Roman" w:hAnsi="Times New Roman"/>
+      <w:color w:val="000000"/>
+      <w:sz w:val="24"/>
+    </w:rPr>
   </w:style>
   <w:style w:customStyle="1" w:styleId="Figure" w:type="paragraph">
     <w:name w:val="Figure"/>
     <w:basedOn w:val="Normal"/>
+    <w:pPr>
+      <w:spacing w:line="276" w:lineRule="auto"/>
+      <w:jc w:val="both"/>
+    </w:pPr>
+    <w:rPr>
+      <w:rFonts w:ascii="Times New Roman" w:eastAsia="Times New Roman" w:hAnsi="Times New Roman"/>
+      <w:color w:val="000000"/>
+      <w:sz w:val="24"/>
+    </w:rPr>
   </w:style>
   <w:style w:customStyle="1" w:styleId="CaptionedFigure" w:type="paragraph">
     <w:name w:val="Captioned Figure"/>
     <w:basedOn w:val="Figure"/>
     <w:pPr>
       <w:keepNext/>
+      <w:spacing w:line="276" w:lineRule="auto"/>
+      <w:jc w:val="both"/>
     </w:pPr>
+    <w:rPr>
+      <w:rFonts w:ascii="Times New Roman" w:eastAsia="Times New Roman" w:hAnsi="Times New Roman"/>
+      <w:color w:val="000000"/>
+      <w:sz w:val="24"/>
+    </w:rPr>
   </w:style>
   <w:style w:customStyle="1" w:styleId="BodyTextChar" w:type="character">
     <w:name w:val="Body Text Char"/>
     <w:basedOn w:val="DefaultParagraphFont"/>
     <w:link w:val="BodyText"/>
+    <w:rPr>
+      <w:rFonts w:ascii="Times New Roman" w:eastAsia="Times New Roman" w:hAnsi="Times New Roman"/>
+      <w:color w:val="000000"/>
+      <w:sz w:val="24"/>
+    </w:rPr>
   </w:style>
   <w:style w:customStyle="1" w:styleId="VerbatimChar" w:type="character">
     <w:name w:val="Verbatim Char"/>
     <w:basedOn w:val="BodyTextChar"/>
     <w:rPr>
-      <w:rFonts w:ascii="Consolas" w:hAnsi="Consolas"/>
-      <w:sz w:val="22"/>
+      <w:rFonts w:ascii="Times New Roman" w:eastAsia="Times New Roman" w:hAnsi="Times New Roman"/>
+      <w:color w:val="000000"/>
+      <w:sz w:val="24"/>
     </w:rPr>
   </w:style>
   <w:style w:customStyle="1" w:styleId="SectionNumber" w:type="character">
     <w:name w:val="Section Number"/>
     <w:basedOn w:val="BodyTextChar"/>
+    <w:rPr>
+      <w:rFonts w:ascii="Times New Roman" w:eastAsia="Times New Roman" w:hAnsi="Times New Roman"/>
+      <w:color w:val="000000"/>
+      <w:sz w:val="24"/>
+    </w:rPr>
   </w:style>
   <w:style w:styleId="FootnoteReference" w:type="character">
     <w:name w:val="Footnote Reference"/>
     <w:basedOn w:val="BodyTextChar"/>
     <w:rPr>
+      <w:rFonts w:ascii="Times New Roman" w:eastAsia="Times New Roman" w:hAnsi="Times New Roman"/>
+      <w:color w:val="000000"/>
+      <w:sz w:val="24"/>
       <w:vertAlign w:val="superscript"/>
     </w:rPr>
   </w:style>
@@ -8714,7 +8905,9 @@
     <w:name w:val="Hyperlink"/>
     <w:basedOn w:val="BodyTextChar"/>
     <w:rPr>
-      <w:color w:themeColor="accent1" w:val="4F81BD"/>
+      <w:rFonts w:ascii="Times New Roman" w:eastAsia="Times New Roman" w:hAnsi="Times New Roman"/>
+      <w:color w:val="000000"/>
+      <w:sz w:val="24"/>
     </w:rPr>
   </w:style>
   <w:style w:styleId="TOCHeading" w:type="paragraph">
@@ -8725,14 +8918,16 @@
     <w:unhideWhenUsed/>
     <w:qFormat/>
     <w:pPr>
-      <w:spacing w:before="240" w:line="259" w:lineRule="auto"/>
+      <w:spacing w:before="240" w:line="276" w:lineRule="auto"/>
+      <w:jc w:val="both"/>
       <w:outlineLvl w:val="9"/>
     </w:pPr>
     <w:rPr>
-      <w:rFonts w:asciiTheme="majorHAnsi" w:cstheme="majorBidi" w:eastAsiaTheme="majorEastAsia" w:hAnsiTheme="majorHAnsi"/>
+      <w:rFonts w:ascii="Times New Roman" w:asciiTheme="majorHAnsi" w:cstheme="majorBidi" w:eastAsia="Times New Roman" w:eastAsiaTheme="majorEastAsia" w:hAnsi="Times New Roman" w:hAnsiTheme="majorHAnsi"/>
       <w:b w:val="0"/>
       <w:bCs w:val="0"/>
-      <w:color w:themeColor="accent1" w:themeShade="BF" w:val="365F91"/>
+      <w:color w:val="000000"/>
+      <w:sz w:val="24"/>
     </w:rPr>
   </w:style>
   <w:style w:type="paragraph" w:customStyle="1" w:styleId="SourceCode">

</xml_diff>